<commit_message>
Update requirement doc; add static/.gitkeep and reference images
Co-Authored-By: Claude Opus 4.8 <noreply@anthropic.com>
</commit_message>
<xml_diff>
--- a/Requirement/มาตรฐานการคำนวณ.docx
+++ b/Requirement/มาตรฐานการคำนวณ.docx
@@ -16129,7 +16129,16 @@
           <w:szCs w:val="32"/>
           <w:cs/>
         </w:rPr>
-        <w:t>นัยสำคัญตำแหน่งที่สอง</w:t>
+        <w:t>นัยสำคัญตำแหน่งที่</w:t>
+      </w:r>
+      <w:r>
+        <w:rPr>
+          <w:rFonts w:asciiTheme="minorBidi" w:hAnsiTheme="minorBidi" w:cs="Cordia New" w:hint="cs"/>
+          <w:sz w:val="32"/>
+          <w:szCs w:val="32"/>
+          <w:cs/>
+        </w:rPr>
+        <w:t>สาม</w:t>
       </w:r>
     </w:p>
     <w:p>
@@ -16491,7 +16500,7 @@
           <w:szCs w:val="32"/>
           <w:cs/>
         </w:rPr>
-        <w:t>1</w:t>
+        <w:t>สอง</w:t>
       </w:r>
       <w:r>
         <w:rPr>
@@ -16537,7 +16546,7 @@
           <w:szCs w:val="32"/>
           <w:cs/>
         </w:rPr>
-        <w:t>1</w:t>
+        <w:t>สอง</w:t>
       </w:r>
       <w:r>
         <w:rPr>
@@ -16661,7 +16670,7 @@
           <w:szCs w:val="32"/>
           <w:cs/>
         </w:rPr>
-        <w:t>1</w:t>
+        <w:t>สอง</w:t>
       </w:r>
       <w:r>
         <w:rPr>
@@ -16761,6 +16770,20 @@
         </w:rPr>
         <w:t>03</w:t>
       </w:r>
+    </w:p>
+    <w:p>
+      <w:pPr>
+        <w:pStyle w:val="ListParagraph"/>
+        <w:tabs>
+          <w:tab w:val="left" w:pos="1350"/>
+        </w:tabs>
+        <w:ind w:left="2880"/>
+        <w:rPr>
+          <w:rFonts w:asciiTheme="minorBidi" w:hAnsiTheme="minorBidi" w:cs="Cordia New" w:hint="cs"/>
+          <w:sz w:val="32"/>
+          <w:szCs w:val="32"/>
+        </w:rPr>
+      </w:pPr>
     </w:p>
     <w:p>
       <w:pPr>
@@ -18247,23 +18270,7 @@
           <w:sz w:val="32"/>
           <w:szCs w:val="32"/>
         </w:rPr>
-        <w:t xml:space="preserve">NTC , </w:t>
-      </w:r>
-      <w:r>
-        <w:rPr>
-          <w:rFonts w:asciiTheme="minorBidi" w:hAnsiTheme="minorBidi"/>
-          <w:sz w:val="32"/>
-          <w:szCs w:val="32"/>
-        </w:rPr>
-        <w:t>Dilution 0.</w:t>
-      </w:r>
-      <w:r>
-        <w:rPr>
-          <w:rFonts w:asciiTheme="minorBidi" w:hAnsiTheme="minorBidi"/>
-          <w:sz w:val="32"/>
-          <w:szCs w:val="32"/>
-        </w:rPr>
-        <w:t xml:space="preserve">01 = </w:t>
+        <w:t xml:space="preserve">NTC , Dilution 0.01 = </w:t>
       </w:r>
       <w:r>
         <w:rPr>
@@ -18879,7 +18886,7 @@
         </w:tabs>
         <w:ind w:left="180"/>
         <w:rPr>
-          <w:rFonts w:asciiTheme="minorBidi" w:hAnsiTheme="minorBidi" w:hint="cs"/>
+          <w:rFonts w:asciiTheme="minorBidi" w:hAnsiTheme="minorBidi"/>
           <w:sz w:val="20"/>
           <w:szCs w:val="20"/>
         </w:rPr>
@@ -19548,7 +19555,7 @@
           <w:sz w:val="32"/>
           <w:szCs w:val="32"/>
         </w:rPr>
-        <w:t>2</w:t>
+        <w:t xml:space="preserve">2 </w:t>
       </w:r>
       <w:r>
         <w:rPr>
@@ -19564,34 +19571,26 @@
           <w:sz w:val="32"/>
           <w:szCs w:val="32"/>
         </w:rPr>
+        <w:t>Dilution</w:t>
+      </w:r>
+      <w:proofErr w:type="gramEnd"/>
+      <w:r>
+        <w:rPr>
+          <w:rFonts w:asciiTheme="minorBidi" w:hAnsiTheme="minorBidi"/>
+          <w:sz w:val="32"/>
+          <w:szCs w:val="32"/>
+        </w:rPr>
+        <w:t xml:space="preserve"> 0.1=</w:t>
+      </w:r>
+      <w:r>
+        <w:rPr>
+          <w:rFonts w:asciiTheme="minorBidi" w:hAnsiTheme="minorBidi" w:hint="cs"/>
+          <w:sz w:val="32"/>
+          <w:szCs w:val="32"/>
+          <w:cs/>
+        </w:rPr>
         <w:t xml:space="preserve"> </w:t>
       </w:r>
-      <w:r>
-        <w:rPr>
-          <w:rFonts w:asciiTheme="minorBidi" w:hAnsiTheme="minorBidi"/>
-          <w:sz w:val="32"/>
-          <w:szCs w:val="32"/>
-        </w:rPr>
-        <w:t>Dilution</w:t>
-      </w:r>
-      <w:proofErr w:type="gramEnd"/>
-      <w:r>
-        <w:rPr>
-          <w:rFonts w:asciiTheme="minorBidi" w:hAnsiTheme="minorBidi"/>
-          <w:sz w:val="32"/>
-          <w:szCs w:val="32"/>
-        </w:rPr>
-        <w:t xml:space="preserve"> 0.1=</w:t>
-      </w:r>
-      <w:r>
-        <w:rPr>
-          <w:rFonts w:asciiTheme="minorBidi" w:hAnsiTheme="minorBidi" w:hint="cs"/>
-          <w:sz w:val="32"/>
-          <w:szCs w:val="32"/>
-          <w:cs/>
-        </w:rPr>
-        <w:t xml:space="preserve"> </w:t>
-      </w:r>
       <w:proofErr w:type="gramStart"/>
       <w:r>
         <w:rPr>
@@ -19599,15 +19598,7 @@
           <w:sz w:val="32"/>
           <w:szCs w:val="32"/>
         </w:rPr>
-        <w:t>1</w:t>
-      </w:r>
-      <w:r>
-        <w:rPr>
-          <w:rFonts w:asciiTheme="minorBidi" w:hAnsiTheme="minorBidi"/>
-          <w:sz w:val="32"/>
-          <w:szCs w:val="32"/>
-        </w:rPr>
-        <w:t>6</w:t>
+        <w:t>16</w:t>
       </w:r>
       <w:r>
         <w:rPr>
@@ -19912,15 +19903,7 @@
           <w:sz w:val="32"/>
           <w:szCs w:val="32"/>
         </w:rPr>
-        <w:t>1</w:t>
-      </w:r>
-      <w:r>
-        <w:rPr>
-          <w:rFonts w:asciiTheme="minorBidi" w:hAnsiTheme="minorBidi"/>
-          <w:sz w:val="32"/>
-          <w:szCs w:val="32"/>
-        </w:rPr>
-        <w:t>60</w:t>
+        <w:t>160</w:t>
       </w:r>
     </w:p>
     <w:p>
@@ -20058,7 +20041,7 @@
         </w:tabs>
         <w:ind w:left="491"/>
         <w:rPr>
-          <w:rFonts w:asciiTheme="minorBidi" w:hAnsiTheme="minorBidi" w:hint="cs"/>
+          <w:rFonts w:asciiTheme="minorBidi" w:hAnsiTheme="minorBidi"/>
           <w:sz w:val="32"/>
           <w:szCs w:val="32"/>
           <w:cs/>
@@ -20168,7 +20151,7 @@
         </w:tabs>
         <w:ind w:left="180"/>
         <w:rPr>
-          <w:rFonts w:asciiTheme="minorBidi" w:hAnsiTheme="minorBidi" w:hint="cs"/>
+          <w:rFonts w:asciiTheme="minorBidi" w:hAnsiTheme="minorBidi"/>
           <w:sz w:val="20"/>
           <w:szCs w:val="20"/>
         </w:rPr>
@@ -20182,7 +20165,7 @@
         </w:tabs>
         <w:ind w:left="180"/>
         <w:rPr>
-          <w:rFonts w:asciiTheme="minorBidi" w:hAnsiTheme="minorBidi" w:hint="cs"/>
+          <w:rFonts w:asciiTheme="minorBidi" w:hAnsiTheme="minorBidi"/>
           <w:sz w:val="20"/>
           <w:szCs w:val="20"/>
         </w:rPr>
@@ -20194,7 +20177,7 @@
           <w:tab w:val="left" w:pos="1811"/>
         </w:tabs>
         <w:rPr>
-          <w:rFonts w:asciiTheme="minorBidi" w:hAnsiTheme="minorBidi" w:hint="cs"/>
+          <w:rFonts w:asciiTheme="minorBidi" w:hAnsiTheme="minorBidi"/>
           <w:sz w:val="32"/>
           <w:szCs w:val="32"/>
           <w:cs/>
@@ -20207,7 +20190,7 @@
           <w:tab w:val="left" w:pos="1811"/>
         </w:tabs>
         <w:rPr>
-          <w:rFonts w:asciiTheme="minorBidi" w:hAnsiTheme="minorBidi" w:hint="cs"/>
+          <w:rFonts w:asciiTheme="minorBidi" w:hAnsiTheme="minorBidi"/>
           <w:sz w:val="32"/>
           <w:szCs w:val="32"/>
           <w:cs/>

</xml_diff>

<commit_message>
Update calculation standards doc (มาตรฐานการคำนวณ)
Co-Authored-By: Claude Opus 4.8 <noreply@anthropic.com>
</commit_message>
<xml_diff>
--- a/Requirement/มาตรฐานการคำนวณ.docx
+++ b/Requirement/มาตรฐานการคำนวณ.docx
@@ -10327,13 +10327,34 @@
           <w:szCs w:val="20"/>
         </w:rPr>
       </w:pPr>
-      <w:r>
+    </w:p>
+    <w:p>
+      <w:pPr>
+        <w:ind w:left="2160" w:firstLine="250"/>
         <w:rPr>
           <w:rFonts w:asciiTheme="minorBidi" w:hAnsiTheme="minorBidi"/>
           <w:sz w:val="20"/>
           <w:szCs w:val="20"/>
-          <w:cs/>
-        </w:rPr>
+        </w:rPr>
+      </w:pPr>
+    </w:p>
+    <w:p>
+      <w:pPr>
+        <w:ind w:left="2160" w:firstLine="250"/>
+        <w:rPr>
+          <w:rFonts w:ascii="Cordia New" w:hAnsi="Cordia New" w:cs="Cordia New"/>
+          <w:sz w:val="32"/>
+          <w:szCs w:val="32"/>
+        </w:rPr>
+      </w:pPr>
+      <w:r>
+        <w:rPr>
+          <w:rFonts w:ascii="Cordia New" w:hAnsi="Cordia New" w:cs="Cordia New"/>
+          <w:sz w:val="32"/>
+          <w:szCs w:val="32"/>
+          <w:cs/>
+        </w:rPr>
+        <w:lastRenderedPageBreak/>
         <w:t xml:space="preserve">เมื่อ </w:t>
       </w:r>
     </w:p>
@@ -10345,41 +10366,41 @@
         <w:ind w:left="2430"/>
         <w:jc w:val="thaiDistribute"/>
         <w:rPr>
-          <w:rFonts w:asciiTheme="minorBidi" w:hAnsiTheme="minorBidi"/>
-          <w:sz w:val="20"/>
-          <w:szCs w:val="20"/>
-        </w:rPr>
-      </w:pPr>
-      <w:r>
-        <w:rPr>
-          <w:rFonts w:asciiTheme="minorBidi" w:hAnsiTheme="minorBidi"/>
-          <w:sz w:val="20"/>
-          <w:szCs w:val="20"/>
+          <w:rFonts w:ascii="Cordia New" w:hAnsi="Cordia New" w:cs="Cordia New"/>
+          <w:sz w:val="32"/>
+          <w:szCs w:val="32"/>
+        </w:rPr>
+      </w:pPr>
+      <w:r>
+        <w:rPr>
+          <w:rFonts w:ascii="Cordia New" w:hAnsi="Cordia New" w:cs="Cordia New"/>
+          <w:sz w:val="32"/>
+          <w:szCs w:val="32"/>
         </w:rPr>
         <w:t>N</w:t>
       </w:r>
       <w:r>
         <w:rPr>
-          <w:rFonts w:asciiTheme="minorBidi" w:hAnsiTheme="minorBidi"/>
-          <w:sz w:val="20"/>
-          <w:szCs w:val="20"/>
+          <w:rFonts w:ascii="Cordia New" w:hAnsi="Cordia New" w:cs="Cordia New"/>
+          <w:sz w:val="32"/>
+          <w:szCs w:val="32"/>
         </w:rPr>
         <w:tab/>
         <w:t>=</w:t>
       </w:r>
       <w:r>
         <w:rPr>
-          <w:rFonts w:asciiTheme="minorBidi" w:hAnsiTheme="minorBidi"/>
-          <w:sz w:val="20"/>
-          <w:szCs w:val="20"/>
+          <w:rFonts w:ascii="Cordia New" w:hAnsi="Cordia New" w:cs="Cordia New"/>
+          <w:sz w:val="32"/>
+          <w:szCs w:val="32"/>
         </w:rPr>
         <w:tab/>
       </w:r>
       <w:r>
         <w:rPr>
-          <w:rFonts w:asciiTheme="minorBidi" w:hAnsiTheme="minorBidi"/>
-          <w:sz w:val="20"/>
-          <w:szCs w:val="20"/>
+          <w:rFonts w:ascii="Cordia New" w:hAnsi="Cordia New" w:cs="Cordia New"/>
+          <w:sz w:val="32"/>
+          <w:szCs w:val="32"/>
           <w:cs/>
         </w:rPr>
         <w:t xml:space="preserve">จำนวนเชื้อจุลินทรีย์ที่พบในตัวอย่าง </w:t>
@@ -10393,51 +10414,50 @@
         <w:ind w:left="2430"/>
         <w:jc w:val="thaiDistribute"/>
         <w:rPr>
-          <w:rFonts w:asciiTheme="minorBidi" w:hAnsiTheme="minorBidi"/>
-          <w:sz w:val="20"/>
-          <w:szCs w:val="20"/>
-          <w:cs/>
-        </w:rPr>
-      </w:pPr>
-      <w:r>
-        <w:rPr>
-          <w:rFonts w:asciiTheme="minorBidi" w:hAnsiTheme="minorBidi"/>
-          <w:sz w:val="20"/>
-          <w:szCs w:val="20"/>
-        </w:rPr>
-        <w:lastRenderedPageBreak/>
+          <w:rFonts w:ascii="Cordia New" w:hAnsi="Cordia New" w:cs="Cordia New"/>
+          <w:sz w:val="32"/>
+          <w:szCs w:val="32"/>
+          <w:cs/>
+        </w:rPr>
+      </w:pPr>
+      <w:r>
+        <w:rPr>
+          <w:rFonts w:ascii="Cordia New" w:hAnsi="Cordia New" w:cs="Cordia New"/>
+          <w:sz w:val="32"/>
+          <w:szCs w:val="32"/>
+        </w:rPr>
         <w:sym w:font="Symbol" w:char="F053"/>
       </w:r>
       <w:r>
         <w:rPr>
-          <w:rFonts w:asciiTheme="minorBidi" w:hAnsiTheme="minorBidi"/>
-          <w:sz w:val="20"/>
-          <w:szCs w:val="20"/>
+          <w:rFonts w:ascii="Cordia New" w:hAnsi="Cordia New" w:cs="Cordia New"/>
+          <w:sz w:val="32"/>
+          <w:szCs w:val="32"/>
         </w:rPr>
         <w:t>C</w:t>
       </w:r>
       <w:r>
         <w:rPr>
-          <w:rFonts w:asciiTheme="minorBidi" w:hAnsiTheme="minorBidi"/>
-          <w:sz w:val="20"/>
-          <w:szCs w:val="20"/>
+          <w:rFonts w:ascii="Cordia New" w:hAnsi="Cordia New" w:cs="Cordia New"/>
+          <w:sz w:val="32"/>
+          <w:szCs w:val="32"/>
         </w:rPr>
         <w:tab/>
         <w:t>=</w:t>
       </w:r>
       <w:r>
         <w:rPr>
-          <w:rFonts w:asciiTheme="minorBidi" w:hAnsiTheme="minorBidi"/>
-          <w:sz w:val="20"/>
-          <w:szCs w:val="20"/>
+          <w:rFonts w:ascii="Cordia New" w:hAnsi="Cordia New" w:cs="Cordia New"/>
+          <w:sz w:val="32"/>
+          <w:szCs w:val="32"/>
         </w:rPr>
         <w:tab/>
       </w:r>
       <w:r>
         <w:rPr>
-          <w:rFonts w:asciiTheme="minorBidi" w:hAnsiTheme="minorBidi"/>
-          <w:sz w:val="20"/>
-          <w:szCs w:val="20"/>
+          <w:rFonts w:ascii="Cordia New" w:hAnsi="Cordia New" w:cs="Cordia New"/>
+          <w:sz w:val="32"/>
+          <w:szCs w:val="32"/>
           <w:cs/>
         </w:rPr>
         <w:t>ผลรวมของจำนวนโคโลนี</w:t>
@@ -10451,67 +10471,67 @@
         <w:ind w:left="2430"/>
         <w:jc w:val="thaiDistribute"/>
         <w:rPr>
-          <w:rFonts w:asciiTheme="minorBidi" w:hAnsiTheme="minorBidi"/>
-          <w:sz w:val="20"/>
-          <w:szCs w:val="20"/>
-        </w:rPr>
-      </w:pPr>
-      <w:r>
-        <w:rPr>
-          <w:rFonts w:asciiTheme="minorBidi" w:hAnsiTheme="minorBidi"/>
-          <w:sz w:val="20"/>
-          <w:szCs w:val="20"/>
+          <w:rFonts w:ascii="Cordia New" w:hAnsi="Cordia New" w:cs="Cordia New"/>
+          <w:sz w:val="32"/>
+          <w:szCs w:val="32"/>
+        </w:rPr>
+      </w:pPr>
+      <w:r>
+        <w:rPr>
+          <w:rFonts w:ascii="Cordia New" w:hAnsi="Cordia New" w:cs="Cordia New"/>
+          <w:sz w:val="32"/>
+          <w:szCs w:val="32"/>
         </w:rPr>
         <w:t>V</w:t>
       </w:r>
       <w:r>
         <w:rPr>
-          <w:rFonts w:asciiTheme="minorBidi" w:hAnsiTheme="minorBidi"/>
-          <w:sz w:val="20"/>
-          <w:szCs w:val="20"/>
+          <w:rFonts w:ascii="Cordia New" w:hAnsi="Cordia New" w:cs="Cordia New"/>
+          <w:sz w:val="32"/>
+          <w:szCs w:val="32"/>
         </w:rPr>
         <w:tab/>
         <w:t>=</w:t>
       </w:r>
       <w:r>
         <w:rPr>
-          <w:rFonts w:asciiTheme="minorBidi" w:hAnsiTheme="minorBidi"/>
-          <w:sz w:val="20"/>
-          <w:szCs w:val="20"/>
+          <w:rFonts w:ascii="Cordia New" w:hAnsi="Cordia New" w:cs="Cordia New"/>
+          <w:sz w:val="32"/>
+          <w:szCs w:val="32"/>
         </w:rPr>
         <w:tab/>
       </w:r>
       <w:r>
         <w:rPr>
-          <w:rFonts w:asciiTheme="minorBidi" w:hAnsiTheme="minorBidi"/>
-          <w:sz w:val="20"/>
-          <w:szCs w:val="20"/>
+          <w:rFonts w:ascii="Cordia New" w:hAnsi="Cordia New" w:cs="Cordia New"/>
+          <w:sz w:val="32"/>
+          <w:szCs w:val="32"/>
           <w:cs/>
         </w:rPr>
         <w:t xml:space="preserve">ปริมาตร </w:t>
       </w:r>
       <w:r>
         <w:rPr>
-          <w:rFonts w:asciiTheme="minorBidi" w:hAnsiTheme="minorBidi"/>
-          <w:sz w:val="20"/>
-          <w:szCs w:val="20"/>
+          <w:rFonts w:ascii="Cordia New" w:hAnsi="Cordia New" w:cs="Cordia New"/>
+          <w:sz w:val="32"/>
+          <w:szCs w:val="32"/>
         </w:rPr>
         <w:t xml:space="preserve">inoculum </w:t>
       </w:r>
       <w:r>
         <w:rPr>
-          <w:rFonts w:asciiTheme="minorBidi" w:hAnsiTheme="minorBidi"/>
-          <w:sz w:val="20"/>
-          <w:szCs w:val="20"/>
+          <w:rFonts w:ascii="Cordia New" w:hAnsi="Cordia New" w:cs="Cordia New"/>
+          <w:sz w:val="32"/>
+          <w:szCs w:val="32"/>
           <w:cs/>
         </w:rPr>
         <w:t>ที่ใช้ในหน่วยมิลลิลิตร</w:t>
       </w:r>
       <w:r>
         <w:rPr>
-          <w:rFonts w:asciiTheme="minorBidi" w:hAnsiTheme="minorBidi"/>
-          <w:sz w:val="20"/>
-          <w:szCs w:val="20"/>
+          <w:rFonts w:ascii="Cordia New" w:hAnsi="Cordia New" w:cs="Cordia New"/>
+          <w:sz w:val="32"/>
+          <w:szCs w:val="32"/>
         </w:rPr>
         <w:t xml:space="preserve"> </w:t>
       </w:r>
@@ -10524,67 +10544,67 @@
         <w:ind w:left="2430"/>
         <w:jc w:val="thaiDistribute"/>
         <w:rPr>
-          <w:rFonts w:asciiTheme="minorBidi" w:hAnsiTheme="minorBidi"/>
-          <w:sz w:val="20"/>
-          <w:szCs w:val="20"/>
-        </w:rPr>
-      </w:pPr>
-      <w:r>
-        <w:rPr>
-          <w:rFonts w:asciiTheme="minorBidi" w:hAnsiTheme="minorBidi"/>
-          <w:sz w:val="20"/>
-          <w:szCs w:val="20"/>
+          <w:rFonts w:ascii="Cordia New" w:hAnsi="Cordia New" w:cs="Cordia New"/>
+          <w:sz w:val="32"/>
+          <w:szCs w:val="32"/>
+        </w:rPr>
+      </w:pPr>
+      <w:r>
+        <w:rPr>
+          <w:rFonts w:ascii="Cordia New" w:hAnsi="Cordia New" w:cs="Cordia New"/>
+          <w:sz w:val="32"/>
+          <w:szCs w:val="32"/>
         </w:rPr>
         <w:t>n</w:t>
       </w:r>
       <w:r>
         <w:rPr>
-          <w:rFonts w:asciiTheme="minorBidi" w:hAnsiTheme="minorBidi"/>
-          <w:sz w:val="20"/>
-          <w:szCs w:val="20"/>
+          <w:rFonts w:ascii="Cordia New" w:hAnsi="Cordia New" w:cs="Cordia New"/>
+          <w:sz w:val="32"/>
+          <w:szCs w:val="32"/>
           <w:vertAlign w:val="subscript"/>
         </w:rPr>
         <w:t>1</w:t>
       </w:r>
       <w:r>
         <w:rPr>
-          <w:rFonts w:asciiTheme="minorBidi" w:hAnsiTheme="minorBidi"/>
-          <w:sz w:val="20"/>
-          <w:szCs w:val="20"/>
+          <w:rFonts w:ascii="Cordia New" w:hAnsi="Cordia New" w:cs="Cordia New"/>
+          <w:sz w:val="32"/>
+          <w:szCs w:val="32"/>
         </w:rPr>
         <w:tab/>
         <w:t>=</w:t>
       </w:r>
       <w:r>
         <w:rPr>
-          <w:rFonts w:asciiTheme="minorBidi" w:hAnsiTheme="minorBidi"/>
-          <w:sz w:val="20"/>
-          <w:szCs w:val="20"/>
+          <w:rFonts w:ascii="Cordia New" w:hAnsi="Cordia New" w:cs="Cordia New"/>
+          <w:sz w:val="32"/>
+          <w:szCs w:val="32"/>
         </w:rPr>
         <w:tab/>
       </w:r>
       <w:r>
         <w:rPr>
-          <w:rFonts w:asciiTheme="minorBidi" w:hAnsiTheme="minorBidi"/>
-          <w:sz w:val="20"/>
-          <w:szCs w:val="20"/>
+          <w:rFonts w:ascii="Cordia New" w:hAnsi="Cordia New" w:cs="Cordia New"/>
+          <w:sz w:val="32"/>
+          <w:szCs w:val="32"/>
           <w:cs/>
         </w:rPr>
         <w:t xml:space="preserve">จำนวน </w:t>
       </w:r>
       <w:r>
         <w:rPr>
-          <w:rFonts w:asciiTheme="minorBidi" w:hAnsiTheme="minorBidi"/>
-          <w:sz w:val="20"/>
-          <w:szCs w:val="20"/>
+          <w:rFonts w:ascii="Cordia New" w:hAnsi="Cordia New" w:cs="Cordia New"/>
+          <w:sz w:val="32"/>
+          <w:szCs w:val="32"/>
         </w:rPr>
         <w:t xml:space="preserve">plate </w:t>
       </w:r>
       <w:r>
         <w:rPr>
-          <w:rFonts w:asciiTheme="minorBidi" w:hAnsiTheme="minorBidi"/>
-          <w:sz w:val="20"/>
-          <w:szCs w:val="20"/>
+          <w:rFonts w:ascii="Cordia New" w:hAnsi="Cordia New" w:cs="Cordia New"/>
+          <w:sz w:val="32"/>
+          <w:szCs w:val="32"/>
           <w:cs/>
         </w:rPr>
         <w:t>ที่ใช้ในระดับความเจือจางแรก</w:t>
@@ -10598,127 +10618,127 @@
         <w:ind w:left="3600" w:hanging="1170"/>
         <w:jc w:val="thaiDistribute"/>
         <w:rPr>
-          <w:rFonts w:asciiTheme="minorBidi" w:hAnsiTheme="minorBidi"/>
-          <w:sz w:val="20"/>
-          <w:szCs w:val="20"/>
-        </w:rPr>
-      </w:pPr>
-      <w:r>
-        <w:rPr>
-          <w:rFonts w:asciiTheme="minorBidi" w:hAnsiTheme="minorBidi"/>
-          <w:sz w:val="20"/>
-          <w:szCs w:val="20"/>
+          <w:rFonts w:ascii="Cordia New" w:hAnsi="Cordia New" w:cs="Cordia New"/>
+          <w:sz w:val="32"/>
+          <w:szCs w:val="32"/>
+        </w:rPr>
+      </w:pPr>
+      <w:r>
+        <w:rPr>
+          <w:rFonts w:ascii="Cordia New" w:hAnsi="Cordia New" w:cs="Cordia New"/>
+          <w:sz w:val="32"/>
+          <w:szCs w:val="32"/>
         </w:rPr>
         <w:t>n</w:t>
       </w:r>
       <w:r>
         <w:rPr>
-          <w:rFonts w:asciiTheme="minorBidi" w:hAnsiTheme="minorBidi"/>
-          <w:sz w:val="20"/>
-          <w:szCs w:val="20"/>
+          <w:rFonts w:ascii="Cordia New" w:hAnsi="Cordia New" w:cs="Cordia New"/>
+          <w:sz w:val="32"/>
+          <w:szCs w:val="32"/>
           <w:vertAlign w:val="subscript"/>
         </w:rPr>
         <w:t>2</w:t>
       </w:r>
       <w:r>
         <w:rPr>
-          <w:rFonts w:asciiTheme="minorBidi" w:hAnsiTheme="minorBidi"/>
-          <w:sz w:val="20"/>
-          <w:szCs w:val="20"/>
+          <w:rFonts w:ascii="Cordia New" w:hAnsi="Cordia New" w:cs="Cordia New"/>
+          <w:sz w:val="32"/>
+          <w:szCs w:val="32"/>
         </w:rPr>
         <w:tab/>
         <w:t>=</w:t>
       </w:r>
       <w:r>
         <w:rPr>
-          <w:rFonts w:asciiTheme="minorBidi" w:hAnsiTheme="minorBidi"/>
-          <w:sz w:val="20"/>
-          <w:szCs w:val="20"/>
+          <w:rFonts w:ascii="Cordia New" w:hAnsi="Cordia New" w:cs="Cordia New"/>
+          <w:sz w:val="32"/>
+          <w:szCs w:val="32"/>
         </w:rPr>
         <w:tab/>
       </w:r>
       <w:r>
         <w:rPr>
-          <w:rFonts w:asciiTheme="minorBidi" w:hAnsiTheme="minorBidi"/>
-          <w:sz w:val="20"/>
-          <w:szCs w:val="20"/>
+          <w:rFonts w:ascii="Cordia New" w:hAnsi="Cordia New" w:cs="Cordia New"/>
+          <w:sz w:val="32"/>
+          <w:szCs w:val="32"/>
           <w:cs/>
         </w:rPr>
         <w:t>จำนวน</w:t>
       </w:r>
       <w:r>
         <w:rPr>
-          <w:rFonts w:asciiTheme="minorBidi" w:hAnsiTheme="minorBidi"/>
-          <w:sz w:val="20"/>
-          <w:szCs w:val="20"/>
+          <w:rFonts w:ascii="Cordia New" w:hAnsi="Cordia New" w:cs="Cordia New"/>
+          <w:sz w:val="32"/>
+          <w:szCs w:val="32"/>
         </w:rPr>
         <w:t xml:space="preserve"> plate </w:t>
       </w:r>
       <w:r>
         <w:rPr>
-          <w:rFonts w:asciiTheme="minorBidi" w:hAnsiTheme="minorBidi"/>
-          <w:sz w:val="20"/>
-          <w:szCs w:val="20"/>
+          <w:rFonts w:ascii="Cordia New" w:hAnsi="Cordia New" w:cs="Cordia New"/>
+          <w:sz w:val="32"/>
+          <w:szCs w:val="32"/>
           <w:cs/>
         </w:rPr>
         <w:t xml:space="preserve">ที่ใช้ในระดับความเจือจางที่สอง </w:t>
       </w:r>
       <w:r>
         <w:rPr>
-          <w:rFonts w:asciiTheme="minorBidi" w:hAnsiTheme="minorBidi"/>
-          <w:sz w:val="20"/>
-          <w:szCs w:val="20"/>
+          <w:rFonts w:ascii="Cordia New" w:hAnsi="Cordia New" w:cs="Cordia New"/>
+          <w:sz w:val="32"/>
+          <w:szCs w:val="32"/>
         </w:rPr>
         <w:t>(</w:t>
       </w:r>
       <w:r>
         <w:rPr>
-          <w:rFonts w:asciiTheme="minorBidi" w:hAnsiTheme="minorBidi"/>
-          <w:sz w:val="20"/>
-          <w:szCs w:val="20"/>
+          <w:rFonts w:ascii="Cordia New" w:hAnsi="Cordia New" w:cs="Cordia New"/>
+          <w:sz w:val="32"/>
+          <w:szCs w:val="32"/>
           <w:cs/>
         </w:rPr>
         <w:t>กรณีทำ</w:t>
       </w:r>
       <w:r>
         <w:rPr>
-          <w:rFonts w:asciiTheme="minorBidi" w:hAnsiTheme="minorBidi"/>
-          <w:sz w:val="20"/>
-          <w:szCs w:val="20"/>
+          <w:rFonts w:ascii="Cordia New" w:hAnsi="Cordia New" w:cs="Cordia New"/>
+          <w:sz w:val="32"/>
+          <w:szCs w:val="32"/>
         </w:rPr>
         <w:t xml:space="preserve"> 1 </w:t>
       </w:r>
       <w:r>
         <w:rPr>
-          <w:rFonts w:asciiTheme="minorBidi" w:hAnsiTheme="minorBidi"/>
-          <w:sz w:val="20"/>
-          <w:szCs w:val="20"/>
+          <w:rFonts w:ascii="Cordia New" w:hAnsi="Cordia New" w:cs="Cordia New"/>
+          <w:sz w:val="32"/>
+          <w:szCs w:val="32"/>
           <w:cs/>
         </w:rPr>
         <w:t xml:space="preserve">ระดับความเจือจาง </w:t>
       </w:r>
       <w:r>
         <w:rPr>
-          <w:rFonts w:asciiTheme="minorBidi" w:hAnsiTheme="minorBidi"/>
-          <w:sz w:val="20"/>
-          <w:szCs w:val="20"/>
+          <w:rFonts w:ascii="Cordia New" w:hAnsi="Cordia New" w:cs="Cordia New"/>
+          <w:sz w:val="32"/>
+          <w:szCs w:val="32"/>
         </w:rPr>
         <w:t>n</w:t>
       </w:r>
       <w:r>
         <w:rPr>
-          <w:rFonts w:asciiTheme="minorBidi" w:hAnsiTheme="minorBidi"/>
-          <w:sz w:val="20"/>
-          <w:szCs w:val="20"/>
+          <w:rFonts w:ascii="Cordia New" w:hAnsi="Cordia New" w:cs="Cordia New"/>
+          <w:sz w:val="32"/>
+          <w:szCs w:val="32"/>
           <w:vertAlign w:val="subscript"/>
         </w:rPr>
         <w:t>2</w:t>
       </w:r>
       <w:r>
         <w:rPr>
-          <w:rFonts w:asciiTheme="minorBidi" w:hAnsiTheme="minorBidi"/>
-          <w:sz w:val="20"/>
-          <w:szCs w:val="20"/>
+          <w:rFonts w:ascii="Cordia New" w:hAnsi="Cordia New" w:cs="Cordia New"/>
+          <w:sz w:val="32"/>
+          <w:szCs w:val="32"/>
         </w:rPr>
         <w:t xml:space="preserve"> = 0)</w:t>
       </w:r>
@@ -10731,43 +10751,43 @@
         <w:ind w:left="2160"/>
         <w:jc w:val="thaiDistribute"/>
         <w:rPr>
-          <w:rFonts w:asciiTheme="minorBidi" w:hAnsiTheme="minorBidi"/>
-          <w:sz w:val="20"/>
-          <w:szCs w:val="20"/>
-        </w:rPr>
-      </w:pPr>
-      <w:r>
-        <w:rPr>
-          <w:rFonts w:asciiTheme="minorBidi" w:hAnsiTheme="minorBidi"/>
-          <w:sz w:val="20"/>
-          <w:szCs w:val="20"/>
+          <w:rFonts w:ascii="Cordia New" w:hAnsi="Cordia New" w:cs="Cordia New"/>
+          <w:sz w:val="32"/>
+          <w:szCs w:val="32"/>
+        </w:rPr>
+      </w:pPr>
+      <w:r>
+        <w:rPr>
+          <w:rFonts w:ascii="Cordia New" w:hAnsi="Cordia New" w:cs="Cordia New"/>
+          <w:sz w:val="32"/>
+          <w:szCs w:val="32"/>
         </w:rPr>
         <w:tab/>
         <w:t>d</w:t>
       </w:r>
       <w:r>
         <w:rPr>
-          <w:rFonts w:asciiTheme="minorBidi" w:hAnsiTheme="minorBidi"/>
-          <w:sz w:val="20"/>
-          <w:szCs w:val="20"/>
+          <w:rFonts w:ascii="Cordia New" w:hAnsi="Cordia New" w:cs="Cordia New"/>
+          <w:sz w:val="32"/>
+          <w:szCs w:val="32"/>
         </w:rPr>
         <w:tab/>
         <w:t>=</w:t>
       </w:r>
       <w:r>
         <w:rPr>
-          <w:rFonts w:asciiTheme="minorBidi" w:hAnsiTheme="minorBidi"/>
-          <w:sz w:val="20"/>
-          <w:szCs w:val="20"/>
+          <w:rFonts w:ascii="Cordia New" w:hAnsi="Cordia New" w:cs="Cordia New"/>
+          <w:sz w:val="32"/>
+          <w:szCs w:val="32"/>
         </w:rPr>
         <w:tab/>
         <w:t xml:space="preserve">dilution factor </w:t>
       </w:r>
       <w:r>
         <w:rPr>
-          <w:rFonts w:asciiTheme="minorBidi" w:hAnsiTheme="minorBidi"/>
-          <w:sz w:val="20"/>
-          <w:szCs w:val="20"/>
+          <w:rFonts w:ascii="Cordia New" w:hAnsi="Cordia New" w:cs="Cordia New"/>
+          <w:sz w:val="32"/>
+          <w:szCs w:val="32"/>
           <w:cs/>
         </w:rPr>
         <w:t>แรก</w:t>
@@ -10781,49 +10801,49 @@
         <w:ind w:left="2430"/>
         <w:jc w:val="thaiDistribute"/>
         <w:rPr>
-          <w:rFonts w:asciiTheme="minorBidi" w:hAnsiTheme="minorBidi"/>
+          <w:rFonts w:ascii="Cordia New" w:hAnsi="Cordia New" w:cs="Cordia New"/>
           <w:b/>
           <w:bCs/>
-          <w:sz w:val="20"/>
-          <w:szCs w:val="20"/>
-          <w:cs/>
-        </w:rPr>
-      </w:pPr>
-      <w:r>
-        <w:rPr>
-          <w:rFonts w:asciiTheme="minorBidi" w:hAnsiTheme="minorBidi"/>
-          <w:sz w:val="20"/>
-          <w:szCs w:val="20"/>
+          <w:sz w:val="32"/>
+          <w:szCs w:val="32"/>
+          <w:cs/>
+        </w:rPr>
+      </w:pPr>
+      <w:r>
+        <w:rPr>
+          <w:rFonts w:ascii="Cordia New" w:hAnsi="Cordia New" w:cs="Cordia New"/>
+          <w:sz w:val="32"/>
+          <w:szCs w:val="32"/>
           <w:cs/>
         </w:rPr>
         <w:t>หมายเหตุ</w:t>
       </w:r>
       <w:r>
         <w:rPr>
-          <w:rFonts w:asciiTheme="minorBidi" w:hAnsiTheme="minorBidi"/>
+          <w:rFonts w:ascii="Cordia New" w:hAnsi="Cordia New" w:cs="Cordia New"/>
           <w:b/>
           <w:bCs/>
-          <w:sz w:val="20"/>
-          <w:szCs w:val="20"/>
+          <w:sz w:val="32"/>
+          <w:szCs w:val="32"/>
           <w:cs/>
         </w:rPr>
         <w:t xml:space="preserve"> </w:t>
       </w:r>
       <w:r>
         <w:rPr>
-          <w:rFonts w:asciiTheme="minorBidi" w:hAnsiTheme="minorBidi"/>
+          <w:rFonts w:ascii="Cordia New" w:hAnsi="Cordia New" w:cs="Cordia New"/>
           <w:b/>
           <w:bCs/>
-          <w:sz w:val="20"/>
-          <w:szCs w:val="20"/>
+          <w:sz w:val="32"/>
+          <w:szCs w:val="32"/>
         </w:rPr>
         <w:t xml:space="preserve">: </w:t>
       </w:r>
       <w:r>
         <w:rPr>
-          <w:rFonts w:asciiTheme="minorBidi" w:hAnsiTheme="minorBidi"/>
-          <w:sz w:val="20"/>
-          <w:szCs w:val="20"/>
+          <w:rFonts w:ascii="Cordia New" w:hAnsi="Cordia New" w:cs="Cordia New"/>
+          <w:sz w:val="32"/>
+          <w:szCs w:val="32"/>
           <w:cs/>
         </w:rPr>
         <w:t>ปัดเศษผลการคำนวณให้เป็นจำนวนเต็ม</w:t>
@@ -10837,58 +10857,58 @@
         <w:ind w:left="3150"/>
         <w:jc w:val="thaiDistribute"/>
         <w:rPr>
-          <w:rFonts w:asciiTheme="minorBidi" w:hAnsiTheme="minorBidi"/>
-          <w:sz w:val="20"/>
-          <w:szCs w:val="20"/>
-        </w:rPr>
-      </w:pPr>
-      <w:r>
-        <w:rPr>
-          <w:rFonts w:asciiTheme="minorBidi" w:hAnsiTheme="minorBidi"/>
-          <w:sz w:val="20"/>
-          <w:szCs w:val="20"/>
+          <w:rFonts w:ascii="Cordia New" w:hAnsi="Cordia New" w:cs="Cordia New"/>
+          <w:sz w:val="32"/>
+          <w:szCs w:val="32"/>
+        </w:rPr>
+      </w:pPr>
+      <w:r>
+        <w:rPr>
+          <w:rFonts w:ascii="Cordia New" w:hAnsi="Cordia New" w:cs="Cordia New"/>
+          <w:sz w:val="32"/>
+          <w:szCs w:val="32"/>
         </w:rPr>
         <w:t xml:space="preserve">    : </w:t>
       </w:r>
       <w:r>
         <w:rPr>
-          <w:rFonts w:asciiTheme="minorBidi" w:hAnsiTheme="minorBidi"/>
-          <w:sz w:val="20"/>
-          <w:szCs w:val="20"/>
+          <w:rFonts w:ascii="Cordia New" w:hAnsi="Cordia New" w:cs="Cordia New"/>
+          <w:sz w:val="32"/>
+          <w:szCs w:val="32"/>
           <w:cs/>
         </w:rPr>
         <w:t xml:space="preserve">กรณีเลขลำดับที่สามน้อยกว่า </w:t>
       </w:r>
       <w:r>
         <w:rPr>
-          <w:rFonts w:asciiTheme="minorBidi" w:hAnsiTheme="minorBidi"/>
-          <w:sz w:val="20"/>
-          <w:szCs w:val="20"/>
+          <w:rFonts w:ascii="Cordia New" w:hAnsi="Cordia New" w:cs="Cordia New"/>
+          <w:sz w:val="32"/>
+          <w:szCs w:val="32"/>
         </w:rPr>
         <w:t xml:space="preserve">5 </w:t>
       </w:r>
       <w:r>
         <w:rPr>
-          <w:rFonts w:asciiTheme="minorBidi" w:hAnsiTheme="minorBidi"/>
-          <w:sz w:val="20"/>
-          <w:szCs w:val="20"/>
+          <w:rFonts w:ascii="Cordia New" w:hAnsi="Cordia New" w:cs="Cordia New"/>
+          <w:sz w:val="32"/>
+          <w:szCs w:val="32"/>
           <w:cs/>
         </w:rPr>
         <w:t xml:space="preserve">ให้ปัดทิ้ง </w:t>
       </w:r>
       <w:r>
         <w:rPr>
-          <w:rFonts w:asciiTheme="minorBidi" w:hAnsiTheme="minorBidi"/>
-          <w:sz w:val="20"/>
-          <w:szCs w:val="20"/>
+          <w:rFonts w:ascii="Cordia New" w:hAnsi="Cordia New" w:cs="Cordia New"/>
+          <w:sz w:val="32"/>
+          <w:szCs w:val="32"/>
         </w:rPr>
         <w:t>(</w:t>
       </w:r>
       <w:r>
         <w:rPr>
-          <w:rFonts w:asciiTheme="minorBidi" w:hAnsiTheme="minorBidi"/>
-          <w:sz w:val="20"/>
-          <w:szCs w:val="20"/>
+          <w:rFonts w:ascii="Cordia New" w:hAnsi="Cordia New" w:cs="Cordia New"/>
+          <w:sz w:val="32"/>
+          <w:szCs w:val="32"/>
           <w:cs/>
         </w:rPr>
         <w:t>ไม่นำมาคิด)</w:t>
@@ -10903,75 +10923,75 @@
         <w:ind w:left="3510" w:hanging="360"/>
         <w:jc w:val="thaiDistribute"/>
         <w:rPr>
-          <w:rFonts w:asciiTheme="minorBidi" w:hAnsiTheme="minorBidi"/>
-          <w:sz w:val="20"/>
-          <w:szCs w:val="20"/>
-        </w:rPr>
-      </w:pPr>
-      <w:r>
-        <w:rPr>
-          <w:rFonts w:asciiTheme="minorBidi" w:hAnsiTheme="minorBidi"/>
-          <w:sz w:val="20"/>
-          <w:szCs w:val="20"/>
+          <w:rFonts w:ascii="Cordia New" w:hAnsi="Cordia New" w:cs="Cordia New"/>
+          <w:sz w:val="32"/>
+          <w:szCs w:val="32"/>
+        </w:rPr>
+      </w:pPr>
+      <w:r>
+        <w:rPr>
+          <w:rFonts w:ascii="Cordia New" w:hAnsi="Cordia New" w:cs="Cordia New"/>
+          <w:sz w:val="32"/>
+          <w:szCs w:val="32"/>
         </w:rPr>
         <w:t xml:space="preserve">    : </w:t>
       </w:r>
       <w:r>
         <w:rPr>
-          <w:rFonts w:asciiTheme="minorBidi" w:hAnsiTheme="minorBidi"/>
-          <w:sz w:val="20"/>
-          <w:szCs w:val="20"/>
+          <w:rFonts w:ascii="Cordia New" w:hAnsi="Cordia New" w:cs="Cordia New"/>
+          <w:sz w:val="32"/>
+          <w:szCs w:val="32"/>
           <w:cs/>
         </w:rPr>
         <w:t xml:space="preserve">กรณีเลขลำดับที่สามมากกว่าหรือเท่ากับ </w:t>
       </w:r>
       <w:r>
         <w:rPr>
-          <w:rFonts w:asciiTheme="minorBidi" w:hAnsiTheme="minorBidi"/>
-          <w:sz w:val="20"/>
-          <w:szCs w:val="20"/>
+          <w:rFonts w:ascii="Cordia New" w:hAnsi="Cordia New" w:cs="Cordia New"/>
+          <w:sz w:val="32"/>
+          <w:szCs w:val="32"/>
         </w:rPr>
         <w:t>5</w:t>
       </w:r>
       <w:r>
         <w:rPr>
-          <w:rFonts w:asciiTheme="minorBidi" w:hAnsiTheme="minorBidi"/>
-          <w:sz w:val="20"/>
-          <w:szCs w:val="20"/>
+          <w:rFonts w:ascii="Cordia New" w:hAnsi="Cordia New" w:cs="Cordia New"/>
+          <w:sz w:val="32"/>
+          <w:szCs w:val="32"/>
           <w:cs/>
         </w:rPr>
         <w:t xml:space="preserve"> ให้ปัดเลขลำดับที่สอง</w:t>
       </w:r>
       <w:r>
         <w:rPr>
-          <w:rFonts w:asciiTheme="minorBidi" w:hAnsiTheme="minorBidi"/>
-          <w:sz w:val="20"/>
-          <w:szCs w:val="20"/>
+          <w:rFonts w:ascii="Cordia New" w:hAnsi="Cordia New" w:cs="Cordia New"/>
+          <w:sz w:val="32"/>
+          <w:szCs w:val="32"/>
         </w:rPr>
         <w:t xml:space="preserve"> </w:t>
       </w:r>
       <w:r>
         <w:rPr>
-          <w:rFonts w:asciiTheme="minorBidi" w:hAnsiTheme="minorBidi"/>
-          <w:sz w:val="20"/>
-          <w:szCs w:val="20"/>
+          <w:rFonts w:ascii="Cordia New" w:hAnsi="Cordia New" w:cs="Cordia New"/>
+          <w:sz w:val="32"/>
+          <w:szCs w:val="32"/>
           <w:cs/>
         </w:rPr>
         <w:t xml:space="preserve">ขึ้น </w:t>
       </w:r>
       <w:r>
         <w:rPr>
-          <w:rFonts w:asciiTheme="minorBidi" w:hAnsiTheme="minorBidi"/>
-          <w:sz w:val="20"/>
-          <w:szCs w:val="20"/>
+          <w:rFonts w:ascii="Cordia New" w:hAnsi="Cordia New" w:cs="Cordia New"/>
+          <w:sz w:val="32"/>
+          <w:szCs w:val="32"/>
         </w:rPr>
         <w:t xml:space="preserve">1 </w:t>
       </w:r>
       <w:r>
         <w:rPr>
-          <w:rFonts w:asciiTheme="minorBidi" w:hAnsiTheme="minorBidi"/>
-          <w:sz w:val="20"/>
-          <w:szCs w:val="20"/>
+          <w:rFonts w:ascii="Cordia New" w:hAnsi="Cordia New" w:cs="Cordia New"/>
+          <w:sz w:val="32"/>
+          <w:szCs w:val="32"/>
           <w:cs/>
         </w:rPr>
         <w:t>หน่วย</w:t>
@@ -10982,121 +11002,121 @@
         <w:ind w:left="2520"/>
         <w:jc w:val="thaiDistribute"/>
         <w:rPr>
-          <w:rFonts w:asciiTheme="minorBidi" w:hAnsiTheme="minorBidi"/>
-          <w:sz w:val="18"/>
-          <w:szCs w:val="18"/>
-        </w:rPr>
-      </w:pPr>
-      <w:r>
-        <w:rPr>
-          <w:rFonts w:asciiTheme="minorBidi" w:hAnsiTheme="minorBidi"/>
+          <w:rFonts w:ascii="Cordia New" w:hAnsi="Cordia New" w:cs="Cordia New"/>
+          <w:sz w:val="32"/>
+          <w:szCs w:val="32"/>
+        </w:rPr>
+      </w:pPr>
+      <w:r>
+        <w:rPr>
+          <w:rFonts w:ascii="Cordia New" w:hAnsi="Cordia New" w:cs="Cordia New"/>
           <w:b/>
           <w:bCs/>
-          <w:sz w:val="18"/>
-          <w:szCs w:val="18"/>
+          <w:sz w:val="32"/>
+          <w:szCs w:val="32"/>
           <w:cs/>
         </w:rPr>
         <w:t>ตัวอย่าง</w:t>
       </w:r>
       <w:r>
         <w:rPr>
-          <w:rFonts w:asciiTheme="minorBidi" w:hAnsiTheme="minorBidi"/>
-          <w:sz w:val="18"/>
-          <w:szCs w:val="18"/>
+          <w:rFonts w:ascii="Cordia New" w:hAnsi="Cordia New" w:cs="Cordia New"/>
+          <w:sz w:val="32"/>
+          <w:szCs w:val="32"/>
           <w:cs/>
         </w:rPr>
         <w:t xml:space="preserve"> ทำการทดสอบเชื้อจุลินทรีย์โดยใช้ระดับความเจือจางละ </w:t>
       </w:r>
       <w:r>
         <w:rPr>
-          <w:rFonts w:asciiTheme="minorBidi" w:hAnsiTheme="minorBidi"/>
-          <w:sz w:val="18"/>
-          <w:szCs w:val="18"/>
+          <w:rFonts w:ascii="Cordia New" w:hAnsi="Cordia New" w:cs="Cordia New"/>
+          <w:sz w:val="32"/>
+          <w:szCs w:val="32"/>
         </w:rPr>
         <w:t xml:space="preserve">1 </w:t>
       </w:r>
       <w:r>
         <w:rPr>
-          <w:rFonts w:asciiTheme="minorBidi" w:hAnsiTheme="minorBidi"/>
-          <w:sz w:val="18"/>
-          <w:szCs w:val="18"/>
+          <w:rFonts w:ascii="Cordia New" w:hAnsi="Cordia New" w:cs="Cordia New"/>
+          <w:sz w:val="32"/>
+          <w:szCs w:val="32"/>
           <w:cs/>
         </w:rPr>
         <w:t xml:space="preserve">เพลท ผลการทดสอบพบว่าโคโลนีที่ระดับความเจือจาง </w:t>
       </w:r>
       <w:r>
         <w:rPr>
-          <w:rFonts w:asciiTheme="minorBidi" w:hAnsiTheme="minorBidi"/>
-          <w:sz w:val="18"/>
-          <w:szCs w:val="18"/>
+          <w:rFonts w:ascii="Cordia New" w:hAnsi="Cordia New" w:cs="Cordia New"/>
+          <w:sz w:val="32"/>
+          <w:szCs w:val="32"/>
         </w:rPr>
         <w:t>10</w:t>
       </w:r>
       <w:r>
         <w:rPr>
-          <w:rFonts w:asciiTheme="minorBidi" w:hAnsiTheme="minorBidi"/>
-          <w:sz w:val="18"/>
-          <w:szCs w:val="18"/>
+          <w:rFonts w:ascii="Cordia New" w:hAnsi="Cordia New" w:cs="Cordia New"/>
+          <w:sz w:val="32"/>
+          <w:szCs w:val="32"/>
           <w:vertAlign w:val="superscript"/>
         </w:rPr>
         <w:t>-2</w:t>
       </w:r>
       <w:r>
         <w:rPr>
-          <w:rFonts w:asciiTheme="minorBidi" w:hAnsiTheme="minorBidi"/>
-          <w:sz w:val="18"/>
-          <w:szCs w:val="18"/>
+          <w:rFonts w:ascii="Cordia New" w:hAnsi="Cordia New" w:cs="Cordia New"/>
+          <w:sz w:val="32"/>
+          <w:szCs w:val="32"/>
         </w:rPr>
         <w:t xml:space="preserve"> </w:t>
       </w:r>
       <w:r>
         <w:rPr>
-          <w:rFonts w:asciiTheme="minorBidi" w:hAnsiTheme="minorBidi"/>
-          <w:sz w:val="18"/>
-          <w:szCs w:val="18"/>
+          <w:rFonts w:ascii="Cordia New" w:hAnsi="Cordia New" w:cs="Cordia New"/>
+          <w:sz w:val="32"/>
+          <w:szCs w:val="32"/>
           <w:cs/>
         </w:rPr>
         <w:t xml:space="preserve">เท่ากับ </w:t>
       </w:r>
       <w:r>
         <w:rPr>
-          <w:rFonts w:asciiTheme="minorBidi" w:hAnsiTheme="minorBidi"/>
-          <w:sz w:val="18"/>
-          <w:szCs w:val="18"/>
+          <w:rFonts w:ascii="Cordia New" w:hAnsi="Cordia New" w:cs="Cordia New"/>
+          <w:sz w:val="32"/>
+          <w:szCs w:val="32"/>
         </w:rPr>
         <w:t xml:space="preserve"> 135  </w:t>
       </w:r>
       <w:r>
         <w:rPr>
-          <w:rFonts w:asciiTheme="minorBidi" w:hAnsiTheme="minorBidi"/>
-          <w:sz w:val="18"/>
-          <w:szCs w:val="18"/>
+          <w:rFonts w:ascii="Cordia New" w:hAnsi="Cordia New" w:cs="Cordia New"/>
+          <w:sz w:val="32"/>
+          <w:szCs w:val="32"/>
           <w:cs/>
         </w:rPr>
         <w:t xml:space="preserve">โคโลนี และที่ระดับความเจือจาง </w:t>
       </w:r>
       <w:r>
         <w:rPr>
-          <w:rFonts w:asciiTheme="minorBidi" w:hAnsiTheme="minorBidi"/>
-          <w:sz w:val="18"/>
-          <w:szCs w:val="18"/>
+          <w:rFonts w:ascii="Cordia New" w:hAnsi="Cordia New" w:cs="Cordia New"/>
+          <w:sz w:val="32"/>
+          <w:szCs w:val="32"/>
         </w:rPr>
         <w:t>10</w:t>
       </w:r>
       <w:r>
         <w:rPr>
-          <w:rFonts w:asciiTheme="minorBidi" w:hAnsiTheme="minorBidi"/>
-          <w:sz w:val="18"/>
-          <w:szCs w:val="18"/>
+          <w:rFonts w:ascii="Cordia New" w:hAnsi="Cordia New" w:cs="Cordia New"/>
+          <w:sz w:val="32"/>
+          <w:szCs w:val="32"/>
           <w:vertAlign w:val="superscript"/>
         </w:rPr>
         <w:t>-</w:t>
       </w:r>
       <w:r>
         <w:rPr>
-          <w:rFonts w:asciiTheme="minorBidi" w:hAnsiTheme="minorBidi"/>
-          <w:sz w:val="18"/>
-          <w:szCs w:val="18"/>
+          <w:rFonts w:ascii="Cordia New" w:hAnsi="Cordia New" w:cs="Cordia New"/>
+          <w:sz w:val="32"/>
+          <w:szCs w:val="32"/>
           <w:vertAlign w:val="superscript"/>
           <w:cs/>
         </w:rPr>
@@ -11104,51 +11124,51 @@
       </w:r>
       <w:r>
         <w:rPr>
-          <w:rFonts w:asciiTheme="minorBidi" w:hAnsiTheme="minorBidi"/>
-          <w:sz w:val="18"/>
-          <w:szCs w:val="18"/>
+          <w:rFonts w:ascii="Cordia New" w:hAnsi="Cordia New" w:cs="Cordia New"/>
+          <w:sz w:val="32"/>
+          <w:szCs w:val="32"/>
         </w:rPr>
         <w:t xml:space="preserve"> </w:t>
       </w:r>
       <w:r>
         <w:rPr>
-          <w:rFonts w:asciiTheme="minorBidi" w:hAnsiTheme="minorBidi"/>
-          <w:sz w:val="18"/>
-          <w:szCs w:val="18"/>
+          <w:rFonts w:ascii="Cordia New" w:hAnsi="Cordia New" w:cs="Cordia New"/>
+          <w:sz w:val="32"/>
+          <w:szCs w:val="32"/>
           <w:cs/>
         </w:rPr>
         <w:t xml:space="preserve">เท่ากับ </w:t>
       </w:r>
       <w:r>
         <w:rPr>
-          <w:rFonts w:asciiTheme="minorBidi" w:hAnsiTheme="minorBidi"/>
-          <w:sz w:val="18"/>
-          <w:szCs w:val="18"/>
+          <w:rFonts w:ascii="Cordia New" w:hAnsi="Cordia New" w:cs="Cordia New"/>
+          <w:sz w:val="32"/>
+          <w:szCs w:val="32"/>
         </w:rPr>
         <w:t xml:space="preserve">14 </w:t>
       </w:r>
       <w:r>
         <w:rPr>
-          <w:rFonts w:asciiTheme="minorBidi" w:hAnsiTheme="minorBidi"/>
-          <w:sz w:val="18"/>
-          <w:szCs w:val="18"/>
+          <w:rFonts w:ascii="Cordia New" w:hAnsi="Cordia New" w:cs="Cordia New"/>
+          <w:sz w:val="32"/>
+          <w:szCs w:val="32"/>
           <w:cs/>
         </w:rPr>
         <w:t>โคโลนี</w:t>
       </w:r>
       <w:r>
         <w:rPr>
-          <w:rFonts w:asciiTheme="minorBidi" w:hAnsiTheme="minorBidi"/>
-          <w:sz w:val="18"/>
-          <w:szCs w:val="18"/>
+          <w:rFonts w:ascii="Cordia New" w:hAnsi="Cordia New" w:cs="Cordia New"/>
+          <w:sz w:val="32"/>
+          <w:szCs w:val="32"/>
         </w:rPr>
         <w:t xml:space="preserve"> </w:t>
       </w:r>
       <w:r>
         <w:rPr>
-          <w:rFonts w:asciiTheme="minorBidi" w:hAnsiTheme="minorBidi"/>
-          <w:sz w:val="18"/>
-          <w:szCs w:val="18"/>
+          <w:rFonts w:ascii="Cordia New" w:hAnsi="Cordia New" w:cs="Cordia New"/>
+          <w:sz w:val="32"/>
+          <w:szCs w:val="32"/>
           <w:cs/>
         </w:rPr>
         <w:t>คำนวณผลการทดสอบได้ดังนี้</w:t>
@@ -11158,25 +11178,25 @@
       <w:pPr>
         <w:ind w:left="2520"/>
         <w:rPr>
-          <w:rFonts w:asciiTheme="minorBidi" w:hAnsiTheme="minorBidi"/>
-          <w:sz w:val="18"/>
-          <w:szCs w:val="18"/>
-        </w:rPr>
-      </w:pPr>
-      <w:r>
-        <w:rPr>
-          <w:rFonts w:asciiTheme="minorBidi" w:hAnsiTheme="minorBidi"/>
-          <w:sz w:val="18"/>
-          <w:szCs w:val="18"/>
+          <w:rFonts w:ascii="Cordia New" w:hAnsi="Cordia New" w:cs="Cordia New"/>
+          <w:sz w:val="32"/>
+          <w:szCs w:val="32"/>
+        </w:rPr>
+      </w:pPr>
+      <w:r>
+        <w:rPr>
+          <w:rFonts w:ascii="Cordia New" w:hAnsi="Cordia New" w:cs="Cordia New"/>
+          <w:sz w:val="32"/>
+          <w:szCs w:val="32"/>
           <w:cs/>
         </w:rPr>
         <w:t xml:space="preserve">จากสูตร  </w:t>
       </w:r>
       <w:r>
         <w:rPr>
-          <w:rFonts w:asciiTheme="minorBidi" w:hAnsiTheme="minorBidi"/>
-          <w:sz w:val="18"/>
-          <w:szCs w:val="18"/>
+          <w:rFonts w:ascii="Cordia New" w:hAnsi="Cordia New" w:cs="Cordia New"/>
+          <w:sz w:val="32"/>
+          <w:szCs w:val="32"/>
           <w:lang w:val="en-GB"/>
         </w:rPr>
         <w:br/>
@@ -11191,9 +11211,9 @@
               <m:nor/>
             </m:rPr>
             <w:rPr>
-              <w:rFonts w:asciiTheme="minorBidi" w:hAnsiTheme="minorBidi"/>
-              <w:sz w:val="18"/>
-              <w:szCs w:val="18"/>
+              <w:rFonts w:ascii="Cordia New" w:hAnsi="Cordia New" w:cs="Cordia New"/>
+              <w:sz w:val="32"/>
+              <w:szCs w:val="32"/>
               <w:lang w:val="en-GB"/>
             </w:rPr>
             <m:t xml:space="preserve">N </m:t>
@@ -11203,9 +11223,9 @@
               <m:nor/>
             </m:rPr>
             <w:rPr>
-              <w:rFonts w:asciiTheme="minorBidi" w:hAnsiTheme="minorBidi"/>
-              <w:sz w:val="18"/>
-              <w:szCs w:val="18"/>
+              <w:rFonts w:ascii="Cordia New" w:hAnsi="Cordia New" w:cs="Cordia New"/>
+              <w:sz w:val="32"/>
+              <w:szCs w:val="32"/>
               <w:cs/>
             </w:rPr>
             <m:t>=</m:t>
@@ -11214,9 +11234,9 @@
             <m:fPr>
               <m:ctrlPr>
                 <w:rPr>
-                  <w:rFonts w:ascii="Cambria Math" w:hAnsi="Cambria Math"/>
-                  <w:sz w:val="18"/>
-                  <w:szCs w:val="18"/>
+                  <w:rFonts w:ascii="Cambria Math" w:hAnsi="Cambria Math" w:cs="Cordia New"/>
+                  <w:sz w:val="32"/>
+                  <w:szCs w:val="32"/>
                 </w:rPr>
               </m:ctrlPr>
             </m:fPr>
@@ -11226,9 +11246,9 @@
                   <m:nor/>
                 </m:rPr>
                 <w:rPr>
-                  <w:rFonts w:asciiTheme="minorBidi" w:hAnsiTheme="minorBidi"/>
-                  <w:sz w:val="18"/>
-                  <w:szCs w:val="18"/>
+                  <w:rFonts w:ascii="Cordia New" w:hAnsi="Cordia New" w:cs="Cordia New"/>
+                  <w:sz w:val="32"/>
+                  <w:szCs w:val="32"/>
                 </w:rPr>
                 <w:sym w:font="Symbol" w:char="F053"/>
               </m:r>
@@ -11237,17 +11257,17 @@
                   <m:nor/>
                 </m:rPr>
                 <w:rPr>
-                  <w:rFonts w:asciiTheme="minorBidi" w:hAnsiTheme="minorBidi"/>
-                  <w:sz w:val="18"/>
-                  <w:szCs w:val="18"/>
+                  <w:rFonts w:ascii="Cordia New" w:hAnsi="Cordia New" w:cs="Cordia New"/>
+                  <w:sz w:val="32"/>
+                  <w:szCs w:val="32"/>
                 </w:rPr>
                 <m:t xml:space="preserve">C </m:t>
               </m:r>
               <m:ctrlPr>
                 <w:rPr>
-                  <w:rFonts w:ascii="Cambria Math" w:hAnsi="Cambria Math"/>
-                  <w:sz w:val="18"/>
-                  <w:szCs w:val="18"/>
+                  <w:rFonts w:ascii="Cambria Math" w:hAnsi="Cambria Math" w:cs="Cordia New"/>
+                  <w:sz w:val="32"/>
+                  <w:szCs w:val="32"/>
                   <w:cs/>
                 </w:rPr>
               </m:ctrlPr>
@@ -11258,9 +11278,9 @@
                   <m:nor/>
                 </m:rPr>
                 <w:rPr>
-                  <w:rFonts w:asciiTheme="minorBidi" w:hAnsiTheme="minorBidi"/>
-                  <w:sz w:val="18"/>
-                  <w:szCs w:val="18"/>
+                  <w:rFonts w:ascii="Cordia New" w:hAnsi="Cordia New" w:cs="Cordia New"/>
+                  <w:sz w:val="32"/>
+                  <w:szCs w:val="32"/>
                 </w:rPr>
                 <m:t>V×[</m:t>
               </m:r>
@@ -11268,9 +11288,9 @@
                 <m:sSubPr>
                   <m:ctrlPr>
                     <w:rPr>
-                      <w:rFonts w:ascii="Cambria Math" w:hAnsi="Cambria Math"/>
-                      <w:sz w:val="18"/>
-                      <w:szCs w:val="18"/>
+                      <w:rFonts w:ascii="Cambria Math" w:hAnsi="Cambria Math" w:cs="Cordia New"/>
+                      <w:sz w:val="32"/>
+                      <w:szCs w:val="32"/>
                     </w:rPr>
                   </m:ctrlPr>
                 </m:sSubPr>
@@ -11280,9 +11300,9 @@
                       <m:nor/>
                     </m:rPr>
                     <w:rPr>
-                      <w:rFonts w:asciiTheme="minorBidi" w:hAnsiTheme="minorBidi"/>
-                      <w:sz w:val="18"/>
-                      <w:szCs w:val="18"/>
+                      <w:rFonts w:ascii="Cordia New" w:hAnsi="Cordia New" w:cs="Cordia New"/>
+                      <w:sz w:val="32"/>
+                      <w:szCs w:val="32"/>
                     </w:rPr>
                     <m:t>n</m:t>
                   </m:r>
@@ -11293,9 +11313,9 @@
                       <m:nor/>
                     </m:rPr>
                     <w:rPr>
-                      <w:rFonts w:asciiTheme="minorBidi" w:hAnsiTheme="minorBidi"/>
-                      <w:sz w:val="18"/>
-                      <w:szCs w:val="18"/>
+                      <w:rFonts w:ascii="Cordia New" w:hAnsi="Cordia New" w:cs="Cordia New"/>
+                      <w:sz w:val="32"/>
+                      <w:szCs w:val="32"/>
                     </w:rPr>
                     <m:t>1</m:t>
                   </m:r>
@@ -11306,9 +11326,9 @@
                   <m:nor/>
                 </m:rPr>
                 <w:rPr>
-                  <w:rFonts w:asciiTheme="minorBidi" w:hAnsiTheme="minorBidi"/>
-                  <w:sz w:val="18"/>
-                  <w:szCs w:val="18"/>
+                  <w:rFonts w:ascii="Cordia New" w:hAnsi="Cordia New" w:cs="Cordia New"/>
+                  <w:sz w:val="32"/>
+                  <w:szCs w:val="32"/>
                 </w:rPr>
                 <m:t>+</m:t>
               </m:r>
@@ -11317,10 +11337,10 @@
                   <m:nor/>
                 </m:rPr>
                 <w:rPr>
-                  <w:rFonts w:asciiTheme="minorBidi" w:hAnsiTheme="minorBidi"/>
+                  <w:rFonts w:ascii="Cordia New" w:hAnsi="Cordia New" w:cs="Cordia New"/>
                   <w:iCs/>
-                  <w:sz w:val="18"/>
-                  <w:szCs w:val="18"/>
+                  <w:sz w:val="32"/>
+                  <w:szCs w:val="32"/>
                 </w:rPr>
                 <m:t>(0.1×</m:t>
               </m:r>
@@ -11328,9 +11348,9 @@
                 <m:sSubPr>
                   <m:ctrlPr>
                     <w:rPr>
-                      <w:rFonts w:ascii="Cambria Math" w:hAnsi="Cambria Math"/>
-                      <w:sz w:val="18"/>
-                      <w:szCs w:val="18"/>
+                      <w:rFonts w:ascii="Cambria Math" w:hAnsi="Cambria Math" w:cs="Cordia New"/>
+                      <w:sz w:val="32"/>
+                      <w:szCs w:val="32"/>
                     </w:rPr>
                   </m:ctrlPr>
                 </m:sSubPr>
@@ -11340,9 +11360,9 @@
                       <m:nor/>
                     </m:rPr>
                     <w:rPr>
-                      <w:rFonts w:asciiTheme="minorBidi" w:hAnsiTheme="minorBidi"/>
-                      <w:sz w:val="18"/>
-                      <w:szCs w:val="18"/>
+                      <w:rFonts w:ascii="Cordia New" w:hAnsi="Cordia New" w:cs="Cordia New"/>
+                      <w:sz w:val="32"/>
+                      <w:szCs w:val="32"/>
                     </w:rPr>
                     <m:t>n</m:t>
                   </m:r>
@@ -11353,9 +11373,9 @@
                       <m:nor/>
                     </m:rPr>
                     <w:rPr>
-                      <w:rFonts w:asciiTheme="minorBidi" w:hAnsiTheme="minorBidi"/>
-                      <w:sz w:val="18"/>
-                      <w:szCs w:val="18"/>
+                      <w:rFonts w:ascii="Cordia New" w:hAnsi="Cordia New" w:cs="Cordia New"/>
+                      <w:sz w:val="32"/>
+                      <w:szCs w:val="32"/>
                     </w:rPr>
                     <m:t>2</m:t>
                   </m:r>
@@ -11366,17 +11386,17 @@
                   <m:nor/>
                 </m:rPr>
                 <w:rPr>
-                  <w:rFonts w:asciiTheme="minorBidi" w:hAnsiTheme="minorBidi"/>
-                  <w:sz w:val="18"/>
-                  <w:szCs w:val="18"/>
+                  <w:rFonts w:ascii="Cordia New" w:hAnsi="Cordia New" w:cs="Cordia New"/>
+                  <w:sz w:val="32"/>
+                  <w:szCs w:val="32"/>
                 </w:rPr>
                 <m:t>)]×d]</m:t>
               </m:r>
               <m:ctrlPr>
                 <w:rPr>
-                  <w:rFonts w:ascii="Cambria Math" w:hAnsi="Cambria Math"/>
-                  <w:sz w:val="18"/>
-                  <w:szCs w:val="18"/>
+                  <w:rFonts w:ascii="Cambria Math" w:hAnsi="Cambria Math" w:cs="Cordia New"/>
+                  <w:sz w:val="32"/>
+                  <w:szCs w:val="32"/>
                   <w:cs/>
                 </w:rPr>
               </m:ctrlPr>
@@ -11388,9 +11408,9 @@
     <w:p>
       <w:pPr>
         <w:rPr>
-          <w:rFonts w:asciiTheme="minorBidi" w:hAnsiTheme="minorBidi"/>
-          <w:sz w:val="18"/>
-          <w:szCs w:val="18"/>
+          <w:rFonts w:ascii="Cordia New" w:hAnsi="Cordia New" w:cs="Cordia New"/>
+          <w:sz w:val="32"/>
+          <w:szCs w:val="32"/>
         </w:rPr>
       </w:pPr>
     </w:p>
@@ -11398,26 +11418,26 @@
       <w:pPr>
         <w:ind w:left="2520"/>
         <w:rPr>
-          <w:rFonts w:asciiTheme="minorBidi" w:hAnsiTheme="minorBidi"/>
-          <w:sz w:val="18"/>
-          <w:szCs w:val="18"/>
-          <w:cs/>
-        </w:rPr>
-      </w:pPr>
-      <w:r>
-        <w:rPr>
-          <w:rFonts w:asciiTheme="minorBidi" w:hAnsiTheme="minorBidi"/>
-          <w:sz w:val="18"/>
-          <w:szCs w:val="18"/>
+          <w:rFonts w:ascii="Cordia New" w:hAnsi="Cordia New" w:cs="Cordia New"/>
+          <w:sz w:val="32"/>
+          <w:szCs w:val="32"/>
+          <w:cs/>
+        </w:rPr>
+      </w:pPr>
+      <w:r>
+        <w:rPr>
+          <w:rFonts w:ascii="Cordia New" w:hAnsi="Cordia New" w:cs="Cordia New"/>
+          <w:sz w:val="32"/>
+          <w:szCs w:val="32"/>
           <w:cs/>
         </w:rPr>
         <w:t xml:space="preserve">จะได้ </w:t>
       </w:r>
       <w:r>
         <w:rPr>
-          <w:rFonts w:asciiTheme="minorBidi" w:hAnsiTheme="minorBidi"/>
-          <w:sz w:val="18"/>
-          <w:szCs w:val="18"/>
+          <w:rFonts w:ascii="Cordia New" w:hAnsi="Cordia New" w:cs="Cordia New"/>
+          <w:sz w:val="32"/>
+          <w:szCs w:val="32"/>
           <w:lang w:val="en-GB"/>
         </w:rPr>
         <w:br/>
@@ -11432,9 +11452,9 @@
               <m:nor/>
             </m:rPr>
             <w:rPr>
-              <w:rFonts w:asciiTheme="minorBidi" w:hAnsiTheme="minorBidi"/>
-              <w:sz w:val="18"/>
-              <w:szCs w:val="18"/>
+              <w:rFonts w:ascii="Cordia New" w:hAnsi="Cordia New" w:cs="Cordia New"/>
+              <w:sz w:val="32"/>
+              <w:szCs w:val="32"/>
               <w:lang w:val="en-GB"/>
             </w:rPr>
             <m:t xml:space="preserve">N </m:t>
@@ -11444,9 +11464,9 @@
               <m:nor/>
             </m:rPr>
             <w:rPr>
-              <w:rFonts w:asciiTheme="minorBidi" w:hAnsiTheme="minorBidi"/>
-              <w:sz w:val="18"/>
-              <w:szCs w:val="18"/>
+              <w:rFonts w:ascii="Cordia New" w:hAnsi="Cordia New" w:cs="Cordia New"/>
+              <w:sz w:val="32"/>
+              <w:szCs w:val="32"/>
               <w:cs/>
             </w:rPr>
             <m:t>=</m:t>
@@ -11455,9 +11475,9 @@
             <m:fPr>
               <m:ctrlPr>
                 <w:rPr>
-                  <w:rFonts w:ascii="Cambria Math" w:hAnsi="Cambria Math"/>
-                  <w:sz w:val="18"/>
-                  <w:szCs w:val="18"/>
+                  <w:rFonts w:ascii="Cambria Math" w:hAnsi="Cambria Math" w:cs="Cordia New"/>
+                  <w:sz w:val="32"/>
+                  <w:szCs w:val="32"/>
                 </w:rPr>
               </m:ctrlPr>
             </m:fPr>
@@ -11467,9 +11487,9 @@
                   <m:nor/>
                 </m:rPr>
                 <w:rPr>
-                  <w:rFonts w:asciiTheme="minorBidi" w:hAnsiTheme="minorBidi"/>
-                  <w:sz w:val="18"/>
-                  <w:szCs w:val="18"/>
+                  <w:rFonts w:ascii="Cordia New" w:hAnsi="Cordia New" w:cs="Cordia New"/>
+                  <w:sz w:val="32"/>
+                  <w:szCs w:val="32"/>
                   <w:cs/>
                 </w:rPr>
                 <m:t>135+14</m:t>
@@ -11479,17 +11499,17 @@
                   <m:nor/>
                 </m:rPr>
                 <w:rPr>
-                  <w:rFonts w:asciiTheme="minorBidi" w:hAnsiTheme="minorBidi"/>
-                  <w:sz w:val="18"/>
-                  <w:szCs w:val="18"/>
+                  <w:rFonts w:ascii="Cordia New" w:hAnsi="Cordia New" w:cs="Cordia New"/>
+                  <w:sz w:val="32"/>
+                  <w:szCs w:val="32"/>
                 </w:rPr>
                 <m:t xml:space="preserve"> </m:t>
               </m:r>
               <m:ctrlPr>
                 <w:rPr>
-                  <w:rFonts w:ascii="Cambria Math" w:hAnsi="Cambria Math"/>
-                  <w:sz w:val="18"/>
-                  <w:szCs w:val="18"/>
+                  <w:rFonts w:ascii="Cambria Math" w:hAnsi="Cambria Math" w:cs="Cordia New"/>
+                  <w:sz w:val="32"/>
+                  <w:szCs w:val="32"/>
                   <w:cs/>
                 </w:rPr>
               </m:ctrlPr>
@@ -11500,9 +11520,9 @@
                   <m:nor/>
                 </m:rPr>
                 <w:rPr>
-                  <w:rFonts w:asciiTheme="minorBidi" w:hAnsiTheme="minorBidi"/>
-                  <w:sz w:val="18"/>
-                  <w:szCs w:val="18"/>
+                  <w:rFonts w:ascii="Cordia New" w:hAnsi="Cordia New" w:cs="Cordia New"/>
+                  <w:sz w:val="32"/>
+                  <w:szCs w:val="32"/>
                   <w:cs/>
                 </w:rPr>
                 <m:t>1</m:t>
@@ -11512,9 +11532,9 @@
                   <m:nor/>
                 </m:rPr>
                 <w:rPr>
-                  <w:rFonts w:asciiTheme="minorBidi" w:hAnsiTheme="minorBidi"/>
-                  <w:sz w:val="18"/>
-                  <w:szCs w:val="18"/>
+                  <w:rFonts w:ascii="Cordia New" w:hAnsi="Cordia New" w:cs="Cordia New"/>
+                  <w:sz w:val="32"/>
+                  <w:szCs w:val="32"/>
                 </w:rPr>
                 <m:t>×[</m:t>
               </m:r>
@@ -11523,9 +11543,9 @@
                   <m:nor/>
                 </m:rPr>
                 <w:rPr>
-                  <w:rFonts w:asciiTheme="minorBidi" w:hAnsiTheme="minorBidi"/>
-                  <w:sz w:val="18"/>
-                  <w:szCs w:val="18"/>
+                  <w:rFonts w:ascii="Cordia New" w:hAnsi="Cordia New" w:cs="Cordia New"/>
+                  <w:sz w:val="32"/>
+                  <w:szCs w:val="32"/>
                   <w:cs/>
                 </w:rPr>
                 <m:t>1</m:t>
@@ -11535,9 +11555,9 @@
                   <m:nor/>
                 </m:rPr>
                 <w:rPr>
-                  <w:rFonts w:asciiTheme="minorBidi" w:hAnsiTheme="minorBidi"/>
-                  <w:sz w:val="18"/>
-                  <w:szCs w:val="18"/>
+                  <w:rFonts w:ascii="Cordia New" w:hAnsi="Cordia New" w:cs="Cordia New"/>
+                  <w:sz w:val="32"/>
+                  <w:szCs w:val="32"/>
                 </w:rPr>
                 <m:t>+</m:t>
               </m:r>
@@ -11546,10 +11566,10 @@
                   <m:nor/>
                 </m:rPr>
                 <w:rPr>
-                  <w:rFonts w:asciiTheme="minorBidi" w:hAnsiTheme="minorBidi"/>
+                  <w:rFonts w:ascii="Cordia New" w:hAnsi="Cordia New" w:cs="Cordia New"/>
                   <w:iCs/>
-                  <w:sz w:val="18"/>
-                  <w:szCs w:val="18"/>
+                  <w:sz w:val="32"/>
+                  <w:szCs w:val="32"/>
                 </w:rPr>
                 <m:t>(0.1×</m:t>
               </m:r>
@@ -11558,9 +11578,9 @@
                   <m:nor/>
                 </m:rPr>
                 <w:rPr>
-                  <w:rFonts w:asciiTheme="minorBidi" w:hAnsiTheme="minorBidi"/>
-                  <w:sz w:val="18"/>
-                  <w:szCs w:val="18"/>
+                  <w:rFonts w:ascii="Cordia New" w:hAnsi="Cordia New" w:cs="Cordia New"/>
+                  <w:sz w:val="32"/>
+                  <w:szCs w:val="32"/>
                   <w:cs/>
                 </w:rPr>
                 <m:t>1</m:t>
@@ -11570,9 +11590,9 @@
                   <m:nor/>
                 </m:rPr>
                 <w:rPr>
-                  <w:rFonts w:asciiTheme="minorBidi" w:hAnsiTheme="minorBidi"/>
-                  <w:sz w:val="18"/>
-                  <w:szCs w:val="18"/>
+                  <w:rFonts w:ascii="Cordia New" w:hAnsi="Cordia New" w:cs="Cordia New"/>
+                  <w:sz w:val="32"/>
+                  <w:szCs w:val="32"/>
                 </w:rPr>
                 <m:t>)]×</m:t>
               </m:r>
@@ -11580,10 +11600,10 @@
                 <m:sSupPr>
                   <m:ctrlPr>
                     <w:rPr>
-                      <w:rFonts w:ascii="Cambria Math" w:hAnsi="Cambria Math"/>
+                      <w:rFonts w:ascii="Cambria Math" w:hAnsi="Cambria Math" w:cs="Cordia New"/>
                       <w:i/>
-                      <w:sz w:val="18"/>
-                      <w:szCs w:val="18"/>
+                      <w:sz w:val="32"/>
+                      <w:szCs w:val="32"/>
                     </w:rPr>
                   </m:ctrlPr>
                 </m:sSupPr>
@@ -11593,9 +11613,9 @@
                       <m:nor/>
                     </m:rPr>
                     <w:rPr>
-                      <w:rFonts w:asciiTheme="minorBidi" w:hAnsiTheme="minorBidi"/>
-                      <w:sz w:val="18"/>
-                      <w:szCs w:val="18"/>
+                      <w:rFonts w:ascii="Cordia New" w:hAnsi="Cordia New" w:cs="Cordia New"/>
+                      <w:sz w:val="32"/>
+                      <w:szCs w:val="32"/>
                     </w:rPr>
                     <m:t>10</m:t>
                   </m:r>
@@ -11606,9 +11626,9 @@
                       <m:nor/>
                     </m:rPr>
                     <w:rPr>
-                      <w:rFonts w:asciiTheme="minorBidi" w:hAnsiTheme="minorBidi"/>
-                      <w:sz w:val="18"/>
-                      <w:szCs w:val="18"/>
+                      <w:rFonts w:ascii="Cordia New" w:hAnsi="Cordia New" w:cs="Cordia New"/>
+                      <w:sz w:val="32"/>
+                      <w:szCs w:val="32"/>
                     </w:rPr>
                     <m:t>-2</m:t>
                   </m:r>
@@ -11619,17 +11639,17 @@
                   <m:nor/>
                 </m:rPr>
                 <w:rPr>
-                  <w:rFonts w:asciiTheme="minorBidi" w:hAnsiTheme="minorBidi"/>
-                  <w:sz w:val="18"/>
-                  <w:szCs w:val="18"/>
+                  <w:rFonts w:ascii="Cordia New" w:hAnsi="Cordia New" w:cs="Cordia New"/>
+                  <w:sz w:val="32"/>
+                  <w:szCs w:val="32"/>
                 </w:rPr>
                 <m:t>]</m:t>
               </m:r>
               <m:ctrlPr>
                 <w:rPr>
-                  <w:rFonts w:ascii="Cambria Math" w:hAnsi="Cambria Math"/>
-                  <w:sz w:val="18"/>
-                  <w:szCs w:val="18"/>
+                  <w:rFonts w:ascii="Cambria Math" w:hAnsi="Cambria Math" w:cs="Cordia New"/>
+                  <w:sz w:val="32"/>
+                  <w:szCs w:val="32"/>
                   <w:cs/>
                 </w:rPr>
               </m:ctrlPr>
@@ -11637,9 +11657,9 @@
           </m:f>
           <m:r>
             <w:rPr>
-              <w:rFonts w:ascii="Cambria Math" w:hAnsi="Cambria Math"/>
-              <w:sz w:val="18"/>
-              <w:szCs w:val="18"/>
+              <w:rFonts w:ascii="Cambria Math" w:hAnsi="Cambria Math" w:cs="Cordia New"/>
+              <w:sz w:val="32"/>
+              <w:szCs w:val="32"/>
             </w:rPr>
             <m:t xml:space="preserve"> </m:t>
           </m:r>
@@ -11648,10 +11668,10 @@
               <m:nor/>
             </m:rPr>
             <w:rPr>
-              <w:rFonts w:asciiTheme="minorBidi" w:hAnsiTheme="minorBidi"/>
+              <w:rFonts w:ascii="Cordia New" w:hAnsi="Cordia New" w:cs="Cordia New"/>
               <w:iCs/>
-              <w:sz w:val="18"/>
-              <w:szCs w:val="18"/>
+              <w:sz w:val="32"/>
+              <w:szCs w:val="32"/>
               <w:lang w:val="en-GB"/>
             </w:rPr>
             <m:t>= 13,545</m:t>
@@ -11661,10 +11681,10 @@
               <m:nor/>
             </m:rPr>
             <w:rPr>
-              <w:rFonts w:asciiTheme="minorBidi" w:hAnsiTheme="minorBidi"/>
+              <w:rFonts w:ascii="Cordia New" w:hAnsi="Cordia New" w:cs="Cordia New"/>
               <w:iCs/>
-              <w:sz w:val="18"/>
-              <w:szCs w:val="18"/>
+              <w:sz w:val="32"/>
+              <w:szCs w:val="32"/>
               <w:lang w:val="en-GB"/>
             </w:rPr>
             <w:br/>
@@ -11680,16 +11700,16 @@
         </w:tabs>
         <w:ind w:left="2430"/>
         <w:rPr>
-          <w:rFonts w:asciiTheme="minorBidi" w:hAnsiTheme="minorBidi"/>
-          <w:sz w:val="18"/>
-          <w:szCs w:val="18"/>
-        </w:rPr>
-      </w:pPr>
-      <w:r>
-        <w:rPr>
-          <w:rFonts w:asciiTheme="minorBidi" w:hAnsiTheme="minorBidi"/>
-          <w:sz w:val="18"/>
-          <w:szCs w:val="18"/>
+          <w:rFonts w:ascii="Cordia New" w:hAnsi="Cordia New" w:cs="Cordia New"/>
+          <w:sz w:val="32"/>
+          <w:szCs w:val="32"/>
+        </w:rPr>
+      </w:pPr>
+      <w:r>
+        <w:rPr>
+          <w:rFonts w:ascii="Cordia New" w:hAnsi="Cordia New" w:cs="Cordia New"/>
+          <w:sz w:val="32"/>
+          <w:szCs w:val="32"/>
           <w:cs/>
         </w:rPr>
         <w:t xml:space="preserve">ดังนั้น จำนวน </w:t>
@@ -11697,94 +11717,94 @@
       <w:proofErr w:type="spellStart"/>
       <w:r>
         <w:rPr>
-          <w:rFonts w:asciiTheme="minorBidi" w:hAnsiTheme="minorBidi"/>
-          <w:sz w:val="18"/>
-          <w:szCs w:val="18"/>
+          <w:rFonts w:ascii="Cordia New" w:hAnsi="Cordia New" w:cs="Cordia New"/>
+          <w:sz w:val="32"/>
+          <w:szCs w:val="32"/>
         </w:rPr>
         <w:t>cfu</w:t>
       </w:r>
       <w:proofErr w:type="spellEnd"/>
       <w:r>
         <w:rPr>
-          <w:rFonts w:asciiTheme="minorBidi" w:hAnsiTheme="minorBidi"/>
-          <w:sz w:val="18"/>
-          <w:szCs w:val="18"/>
+          <w:rFonts w:ascii="Cordia New" w:hAnsi="Cordia New" w:cs="Cordia New"/>
+          <w:sz w:val="32"/>
+          <w:szCs w:val="32"/>
         </w:rPr>
         <w:t xml:space="preserve">/g, ml  </w:t>
       </w:r>
       <w:r>
         <w:rPr>
-          <w:rFonts w:asciiTheme="minorBidi" w:hAnsiTheme="minorBidi"/>
-          <w:sz w:val="18"/>
-          <w:szCs w:val="18"/>
+          <w:rFonts w:ascii="Cordia New" w:hAnsi="Cordia New" w:cs="Cordia New"/>
+          <w:sz w:val="32"/>
+          <w:szCs w:val="32"/>
           <w:cs/>
         </w:rPr>
         <w:t xml:space="preserve">เท่ากับ </w:t>
       </w:r>
       <w:r>
         <w:rPr>
-          <w:rFonts w:asciiTheme="minorBidi" w:hAnsiTheme="minorBidi"/>
-          <w:sz w:val="18"/>
-          <w:szCs w:val="18"/>
+          <w:rFonts w:ascii="Cordia New" w:hAnsi="Cordia New" w:cs="Cordia New"/>
+          <w:sz w:val="32"/>
+          <w:szCs w:val="32"/>
         </w:rPr>
         <w:t>14,000</w:t>
       </w:r>
       <w:r>
         <w:rPr>
-          <w:rFonts w:asciiTheme="minorBidi" w:hAnsiTheme="minorBidi"/>
-          <w:sz w:val="18"/>
-          <w:szCs w:val="18"/>
+          <w:rFonts w:ascii="Cordia New" w:hAnsi="Cordia New" w:cs="Cordia New"/>
+          <w:sz w:val="32"/>
+          <w:szCs w:val="32"/>
           <w:cs/>
         </w:rPr>
         <w:t xml:space="preserve"> </w:t>
       </w:r>
       <w:r>
         <w:rPr>
-          <w:rFonts w:asciiTheme="minorBidi" w:hAnsiTheme="minorBidi"/>
-          <w:sz w:val="18"/>
-          <w:szCs w:val="18"/>
+          <w:rFonts w:ascii="Cordia New" w:hAnsi="Cordia New" w:cs="Cordia New"/>
+          <w:sz w:val="32"/>
+          <w:szCs w:val="32"/>
         </w:rPr>
         <w:t>(</w:t>
       </w:r>
       <w:r>
         <w:rPr>
-          <w:rFonts w:asciiTheme="minorBidi" w:hAnsiTheme="minorBidi"/>
-          <w:sz w:val="18"/>
-          <w:szCs w:val="18"/>
+          <w:rFonts w:ascii="Cordia New" w:hAnsi="Cordia New" w:cs="Cordia New"/>
+          <w:sz w:val="32"/>
+          <w:szCs w:val="32"/>
           <w:cs/>
         </w:rPr>
         <w:t xml:space="preserve">ตัวเลขลำดับที่ </w:t>
       </w:r>
       <w:r>
         <w:rPr>
-          <w:rFonts w:asciiTheme="minorBidi" w:hAnsiTheme="minorBidi"/>
-          <w:sz w:val="18"/>
-          <w:szCs w:val="18"/>
+          <w:rFonts w:ascii="Cordia New" w:hAnsi="Cordia New" w:cs="Cordia New"/>
+          <w:sz w:val="32"/>
+          <w:szCs w:val="32"/>
         </w:rPr>
         <w:t xml:space="preserve">3 </w:t>
       </w:r>
       <w:r>
         <w:rPr>
-          <w:rFonts w:asciiTheme="minorBidi" w:hAnsiTheme="minorBidi"/>
-          <w:sz w:val="18"/>
-          <w:szCs w:val="18"/>
+          <w:rFonts w:ascii="Cordia New" w:hAnsi="Cordia New" w:cs="Cordia New"/>
+          <w:sz w:val="32"/>
+          <w:szCs w:val="32"/>
           <w:cs/>
         </w:rPr>
         <w:t>มากกว่าหรือเท่ากับ</w:t>
       </w:r>
       <w:r>
         <w:rPr>
-          <w:rFonts w:asciiTheme="minorBidi" w:hAnsiTheme="minorBidi"/>
-          <w:sz w:val="18"/>
-          <w:szCs w:val="18"/>
+          <w:rFonts w:ascii="Cordia New" w:hAnsi="Cordia New" w:cs="Cordia New"/>
+          <w:sz w:val="32"/>
+          <w:szCs w:val="32"/>
         </w:rPr>
         <w:t xml:space="preserve"> 5</w:t>
       </w:r>
       <w:r>
         <w:rPr>
-          <w:rFonts w:asciiTheme="minorBidi" w:hAnsiTheme="minorBidi"/>
-          <w:sz w:val="18"/>
-          <w:szCs w:val="18"/>
+          <w:rFonts w:ascii="Cordia New" w:hAnsi="Cordia New" w:cs="Cordia New"/>
+          <w:sz w:val="32"/>
+          <w:szCs w:val="32"/>
           <w:cs/>
         </w:rPr>
         <w:t xml:space="preserve"> </w:t>
@@ -11798,45 +11818,45 @@
         </w:tabs>
         <w:ind w:left="2430"/>
         <w:rPr>
-          <w:rFonts w:asciiTheme="minorBidi" w:hAnsiTheme="minorBidi"/>
-          <w:sz w:val="28"/>
-          <w:szCs w:val="28"/>
-        </w:rPr>
-      </w:pPr>
-      <w:r>
-        <w:rPr>
-          <w:rFonts w:asciiTheme="minorBidi" w:hAnsiTheme="minorBidi"/>
-          <w:sz w:val="18"/>
-          <w:szCs w:val="18"/>
+          <w:rFonts w:ascii="Cordia New" w:hAnsi="Cordia New" w:cs="Cordia New"/>
+          <w:sz w:val="32"/>
+          <w:szCs w:val="32"/>
+        </w:rPr>
+      </w:pPr>
+      <w:r>
+        <w:rPr>
+          <w:rFonts w:ascii="Cordia New" w:hAnsi="Cordia New" w:cs="Cordia New"/>
+          <w:sz w:val="32"/>
+          <w:szCs w:val="32"/>
           <w:cs/>
         </w:rPr>
         <w:t xml:space="preserve">รายงานผล </w:t>
       </w:r>
       <w:r>
         <w:rPr>
-          <w:rFonts w:asciiTheme="minorBidi" w:hAnsiTheme="minorBidi"/>
-          <w:sz w:val="18"/>
-          <w:szCs w:val="18"/>
+          <w:rFonts w:ascii="Cordia New" w:hAnsi="Cordia New" w:cs="Cordia New"/>
+          <w:sz w:val="32"/>
+          <w:szCs w:val="32"/>
         </w:rPr>
         <w:t xml:space="preserve">1.4E+04  </w:t>
       </w:r>
       <w:proofErr w:type="spellStart"/>
       <w:r>
         <w:rPr>
-          <w:rFonts w:asciiTheme="minorBidi" w:hAnsiTheme="minorBidi"/>
-          <w:sz w:val="18"/>
-          <w:szCs w:val="18"/>
+          <w:rFonts w:ascii="Cordia New" w:hAnsi="Cordia New" w:cs="Cordia New"/>
+          <w:sz w:val="32"/>
+          <w:szCs w:val="32"/>
         </w:rPr>
         <w:t>cfu</w:t>
       </w:r>
       <w:proofErr w:type="spellEnd"/>
       <w:r>
         <w:rPr>
-          <w:rFonts w:asciiTheme="minorBidi" w:hAnsiTheme="minorBidi"/>
-          <w:sz w:val="18"/>
-          <w:szCs w:val="18"/>
-        </w:rPr>
-        <w:t xml:space="preserve">/g, ml  </w:t>
+          <w:rFonts w:ascii="Cordia New" w:hAnsi="Cordia New" w:cs="Cordia New"/>
+          <w:sz w:val="32"/>
+          <w:szCs w:val="32"/>
+        </w:rPr>
+        <w:t xml:space="preserve">/g, ml </w:t>
       </w:r>
     </w:p>
     <w:p>
@@ -13029,7 +13049,6 @@
           <w:cs/>
           <w14:ligatures w14:val="none"/>
         </w:rPr>
-        <w:lastRenderedPageBreak/>
         <w:t>ตัวอย่างการคำนวณ:</w:t>
       </w:r>
     </w:p>
@@ -14694,6 +14713,7 @@
           <w:cs/>
           <w14:ligatures w14:val="none"/>
         </w:rPr>
+        <w:lastRenderedPageBreak/>
         <w:t>ไม่มีโคโลนีเจริญเติบโตเลยสักจาน:</w:t>
       </w:r>
       <w:r>
@@ -15841,7 +15861,6 @@
           <w:szCs w:val="32"/>
           <w:cs/>
         </w:rPr>
-        <w:lastRenderedPageBreak/>
         <w:t>1250</w:t>
       </w:r>
       <w:r>
@@ -16779,7 +16798,7 @@
         </w:tabs>
         <w:ind w:left="2880"/>
         <w:rPr>
-          <w:rFonts w:asciiTheme="minorBidi" w:hAnsiTheme="minorBidi" w:cs="Cordia New" w:hint="cs"/>
+          <w:rFonts w:asciiTheme="minorBidi" w:hAnsiTheme="minorBidi" w:cs="Cordia New"/>
           <w:sz w:val="32"/>
           <w:szCs w:val="32"/>
         </w:rPr>
@@ -16978,6 +16997,7 @@
           <w:szCs w:val="32"/>
           <w:cs/>
         </w:rPr>
+        <w:lastRenderedPageBreak/>
         <w:t>กรณีที่พบโคโลนี</w:t>
       </w:r>
       <w:r>
@@ -18918,6 +18938,7 @@
           <w:szCs w:val="32"/>
           <w:cs/>
         </w:rPr>
+        <w:lastRenderedPageBreak/>
         <w:t>กรณี</w:t>
       </w:r>
       <w:r>
@@ -19929,7 +19950,6 @@
           <w:sz w:val="32"/>
           <w:szCs w:val="32"/>
         </w:rPr>
-        <w:lastRenderedPageBreak/>
         <w:t>Column Results</w:t>
       </w:r>
       <w:r>

</xml_diff>